<commit_message>
Week 02: answer-sheet notes and a how-to line in the lecture workbook
- Tutorial Answers .docx: say that the screenshots show the original
  solution's output and the notebooks print the same numbers to
  2 decimals; "Investigate the following:" and "profit of £8." as in
  the tutorial sheet
- 2 LP with Excel Solver.xlsx: cell A12 explains how to run Solver and
  gives the answer (x = 41.14, y = 10.29, profit £277.71); the model
  and Solver settings are unchanged

Text only: no notebook, formula or result changes.

Co-Authored-By: Claude Opus 5.5 <noreply@anthropic.com>
Claude-Session: https://claude.ai/code/session_01Vw4nh2eHzV8787MFDT43D7

[skip ci]
</commit_message>
<xml_diff>
--- a/content/Lectures/Semester 1/Week 02 - Linear Programming 1/4 Tutorial Answers/Week 2 - Linear Programming - Tutorial Answers.docx
+++ b/content/Lectures/Semester 1/Week 02 - Linear Programming 1/4 Tutorial Answers/Week 2 - Linear Programming - Tutorial Answers.docx
@@ -989,6 +989,9 @@
       <w:r>
         <w:t xml:space="preserve"> “Q3 LP with linprog”.</w:t>
       </w:r>
+      <w:r>
+        <w:t xml:space="preserve"> The screenshots in these answers show the output of the original solution; the notebooks print the same numbers as x[1] = …, fval = …, to 2 decimals.</w:t>
+      </w:r>
     </w:p>
     <w:p>
       <w:pPr>
@@ -1464,7 +1467,7 @@
           <w:b/>
           <w:bCs/>
         </w:rPr>
-        <w:t>Investigate the following</w:t>
+        <w:t>Investigate the following:</w:t>
       </w:r>
     </w:p>
     <w:p>
@@ -1498,7 +1501,7 @@
           <w:b/>
           <w:bCs/>
         </w:rPr>
-        <w:t>8</w:t>
+        <w:t>8.</w:t>
       </w:r>
     </w:p>
     <w:p>

</xml_diff>